<commit_message>
chore(v2.9.1): MIGRATION_NOTICE 삭제 + 매뉴얼 버전 changelog 경량화
- MIGRATION_NOTICE_v2.6.1.md 삭제: v2.6.1 1회용 전환 공지(존재하지 않는 sample_v2.6.1·매뉴얼_v2.6.1·2.5.1 폴더 참조). 업그레이드는 upgrade-skill "업그레이드 해줘"가 자동 처리하므로 불요. 히스토리는 git·CHANGELOG에 보존.
- 매뉴얼 docx: §1 개요의 누적된 vX.Y 주요변경 6개 블록(v2.9~v1.6)을 "현재 버전(v2.9.1) 핵심 변경" 1개 + CHANGELOG.md 참조 포인터로 경량화. 사용법·열설명·FAQ·부록 본문은 불변.

Co-Authored-By: Claude Opus 4.8 <noreply@anthropic.com>
</commit_message>
<xml_diff>
--- a/01_매뉴얼/AF_CPG_데이터추출_매뉴얼_v2.9.1.docx
+++ b/01_매뉴얼/AF_CPG_데이터추출_매뉴얼_v2.9.1.docx
@@ -640,16 +640,12 @@
           <w:sz w:val="23"/>
           <w:szCs w:val="23"/>
         </w:rPr>
-        <w:t>v2.9.1 주요 변경</w:t>
+        <w:t>현재 버전 (v2.9.1) 핵심 변경</w:t>
       </w:r>
     </w:p>
     <w:p>
       <w:pPr>
         <w:pStyle w:val="ListParagraph"/>
-        <w:numPr>
-          <w:ilvl w:val="0"/>
-          <w:numId w:val="2"/>
-        </w:numPr>
         <w:spacing w:after="40" w:before="40" w:line="300"/>
       </w:pPr>
       <w:r>
@@ -662,223 +658,12 @@
       </w:r>
     </w:p>
     <w:p>
-      <w:pPr>
-        <w:pStyle w:val="Heading3"/>
-        <w:spacing w:after="120" w:before="220"/>
-      </w:pPr>
-      <w:r>
-        <w:rPr>
-          <w:rFonts w:ascii="맑은 고딕" w:cs="맑은 고딕" w:eastAsia="맑은 고딕" w:hAnsi="맑은 고딕"/>
-          <w:b/>
-          <w:bCs/>
-          <w:color w:val="333333"/>
-          <w:sz w:val="23"/>
-          <w:szCs w:val="23"/>
-        </w:rPr>
-        <w:t>v2.9 주요 변경</w:t>
-      </w:r>
-    </w:p>
-    <w:p>
-      <w:pPr>
-        <w:pStyle w:val="ListParagraph"/>
-        <w:numPr>
-          <w:ilvl w:val="0"/>
-          <w:numId w:val="2"/>
-        </w:numPr>
-        <w:spacing w:after="40" w:before="40" w:line="300"/>
-      </w:pPr>
-      <w:r>
-        <w:rPr>
-          <w:rFonts w:ascii="맑은 고딕" w:cs="맑은 고딕" w:eastAsia="맑은 고딕" w:hAnsi="맑은 고딕"/>
+      <w:r>
+        <w:rPr>
+          <w:rFonts w:ascii="맑은 고딕" w:hAnsi="맑은 고딕"/>
           <w:sz w:val="22"/>
-          <w:szCs w:val="22"/>
-        </w:rPr>
-        <w:t xml:space="preserve">v2.9 (2026-06-08): (1) TER(총유효율) outcome_std 4종 통일 — C열(outcome_std)을 TER(판정기준 불명) / TER-Holter(动态心电图·Holter 기준) / TER-ECG(체표 心电图 기준) / TER-TCM(中医证候 기준) 4종으로 분류. 전부 importance=Important. 원문 판정기준이 불명확하면 무리하게 가르지 않고 단순 TER 사용; 원문 용어는 D열(outcome_original)에 보존. 한 논문에 TER이 2건 이상이면 각각 해당 코드로 추출하되, 메타분석 합산 시 한 연구가 TER에 중복 투입되지 않도록 분석 단계에서 1건만 사용. (출처: Decision Log §2.C-10) (2) comorbidity_code 8(냉동소작/cryoablation) 신설 — 冷冻球囊导管消融(cryoballoon ablation) 등 RF가 아닌 카테터소작은 기존 RFCA(코드 1)와 별개 코드 8로 부여; 시술명 원문은 V열(comorbidity_text)에 보존. (출처: Decision Log §1.U-03) ※ SKILL 문서 경량화가 있었으나 추출 규칙·열 구조·코드값은 불변(48열)이라 작업 방식 변화 없음.</w:t>
-      </w:r>
-    </w:p>
-    <w:p>
-      <w:pPr>
-        <w:pStyle w:val="Heading3"/>
-      </w:pPr>
-      <w:r>
-        <w:t>v2.8.1 주요 변경</w:t>
-      </w:r>
-    </w:p>
-    <w:p>
-      <w:pPr>
-        <w:pStyle w:val="ListParagraph"/>
-      </w:pPr>
-      <w:r>
-        <w:t>v2.8.1 (2026-06-04, 버그 수정): 6C 채팅 출력 구조에 RoB 근거(AJ~AT 11열) 블록 누락 교정 — 6B 점검 항목엔 있으나 출력 구조가 5블록뿐이라 RoB가 채팅에 출력되지 않던 불일치 해소(⑤ RoB 근거 블록 신설, 기존 불확실·NR 항목을 ⑥으로 재번호). 추출 규칙·열 구조·코드값 변경 없음(48열, 회의 결정 무관).</w:t>
-      </w:r>
-    </w:p>
-    <w:p>
-      <w:pPr>
-        <w:pStyle w:val="Heading3"/>
-        <w:spacing w:after="120" w:before="220"/>
-      </w:pPr>
-      <w:r>
-        <w:rPr>
-          <w:rFonts w:ascii="맑은 고딕" w:cs="맑은 고딕" w:eastAsia="맑은 고딕" w:hAnsi="맑은 고딕"/>
-          <w:b/>
-          <w:bCs/>
-          <w:color w:val="333333"/>
-          <w:sz w:val="23"/>
-          <w:szCs w:val="23"/>
-        </w:rPr>
-        <w:t>v2.8 주요 변경</w:t>
-      </w:r>
-    </w:p>
-    <w:p>
-      <w:pPr>
-        <w:pStyle w:val="ListParagraph"/>
-        <w:numPr>
-          <w:ilvl w:val="0"/>
-          <w:numId w:val="2"/>
-        </w:numPr>
-        <w:spacing w:after="40" w:before="40" w:line="300"/>
-      </w:pPr>
-      <w:r>
-        <w:rPr>
-          <w:rFonts w:ascii="맑은 고딕" w:cs="맑은 고딕" w:eastAsia="맑은 고딕" w:hAnsi="맑은 고딕"/>
-          <w:sz w:val="22"/>
-          <w:szCs w:val="22"/>
-        </w:rPr>
-        <w:t>v2.8 (2026-06-01): (1) QoL SF-36 통일 명칭 QOL(SF-36 cited) — 표준(PCS·MCS 각 100점 환산)만 메타분석 MD, 800점 만점 등 비표준 점수체계는 별도 분리 후 SMD; 점수체계는 notes에 기재(미네소타 QOL(Minnesota cited) 선례와 평행). (2) Study ID 중복 a/b 접미사 — 추출 시 중복이면 _a/_b 임시 부여, 마스터 머지 시 merge-skill가 논문 번호 순서대로 a부터 재부여. (3) 다군(3·4·5arm) 처리 — 한 연구당 가장 적합한 1쌍만 추출, 양약을 가장 많이 쓴 군을 대조군으로(보수적). (4) 양약 종류·용량차 제외 — KM+WM_vs_WM라도 양군 양약 종류가 다르거나(항응고제 종류 상이 등) 종류 같고 용량만 다르면 제외(§1.AD-01 보류→확정, 2032 등 소급). (5) RCT 표현 충돌 우선순위 — 무작위 표현과 순서 배정 표현이 동시에 있으면 순서 배정 우선 → non-RCT(제외). ※ 초록만 있는 논문 제외·동일 중복논문 나중 것 배제·2단계 설계 Phase1만·LVDD/LVSD 역전 아웃컴만 제외·동율동+rate 묶임 시 TER만은 케이스 판단(Decision Log 기록). 열 구조는 v2.6 이후 동일(48열); 샘플은 sample_v2.8.xlsx. 소급은 upgrade-skill("업그레이드 해줘")로 처리 — LATEST_VERSION 2.8.</w:t>
-      </w:r>
-    </w:p>
-    <w:p>
-      <w:pPr>
-        <w:pStyle w:val="ListParagraph"/>
-        <w:numPr>
-          <w:ilvl w:val="0"/>
-          <w:numId w:val="2"/>
-        </w:numPr>
-        <w:spacing w:after="40" w:before="40" w:line="300"/>
-      </w:pPr>
-      <w:r>
-        <w:rPr>
-          <w:rFonts w:ascii="맑은 고딕" w:cs="맑은 고딕" w:eastAsia="맑은 고딕" w:hAnsi="맑은 고딕"/>
-          <w:sz w:val="22"/>
-          <w:szCs w:val="22"/>
-        </w:rPr>
-        <w:t>v2.7 (2026-05-27): (1) U열 comorbidity_code 코드 7(노인/노령) 신설 — 선정기준에서 노인을 의도적으로 한정(老年/elderly 키워드 또는 연령 하한 ≥60세)한 경우만 부여. 제목·고찰의 老年 서술뿐이면 코드 미부여하고 V열에 보존. (2) 코드 2(심부전) 기준 명문화 — 선정기준에 심부전 진단명(心力衰竭/HF/HFpEF) 명시 시만 부여; baseline 전수 NYHA 평가·NYHA 단독 inclusion·배제기준 NYHA IV만으로는 부여하지 않음. (3) M열 setting — 입원/외래 불확실 시 추정 금지, NR 처리. (4) Median/Quartile(IQR) 형태로만 보고된 아웃컴은 메타분석 제외 — H~M 셀 NR, V열 val2_type에 IQR 표기, 원문 수치는 notes에 텍스트 보존(IQR→SD 근사 미적용). (5) 한약 다중 처방 처리 보강 — 전원에게 2처방 동시투여 시 합쳐 1주처방으로 기재; 메인 없이 변증별 처방 분기는 "개별화 처방 (변증 분기)"로 1행 통합. (6) comparison_type KM+WM_vs_KM 제외로 정정 — 두 군 차이가 양방약(WM)이라 한약 add-on 효과가 아님(PICO 불일치); 포함 비교쌍은 KM+WM_vs_WM·KM_alone_vs_placebo. 열 구조는 v2.6 이후 동일(48열); 샘플은 sample_v2.7.xlsx.</w:t>
-      </w:r>
-    </w:p>
-    <w:p>
-      <w:pPr>
-        <w:pStyle w:val="Heading3"/>
-        <w:spacing w:after="120" w:before="220"/>
-        <w:rPr/>
-      </w:pPr>
-      <w:r>
-        <w:rPr>
-          <w:rFonts w:ascii="맑은 고딕" w:cs="맑은 고딕" w:eastAsia="맑은 고딕" w:hAnsi="맑은 고딕"/>
-          <w:b/>
-          <w:bCs/>
-          <w:color w:val="333333"/>
-          <w:sz w:val="23"/>
-          <w:szCs w:val="23"/>
-        </w:rPr>
-        <w:t>v2.6.1 주요 변경</w:t>
-      </w:r>
-    </w:p>
-    <w:p>
-      <w:pPr>
-        <w:pStyle w:val="ListParagraph"/>
-        <w:numPr>
-          <w:ilvl w:val="0"/>
-          <w:numId w:val="2"/>
-        </w:numPr>
-        <w:spacing w:after="40" w:before="40" w:line="300"/>
-        <w:rPr/>
-      </w:pPr>
-      <w:r>
-        <w:rPr>
-          <w:rFonts w:ascii="맑은 고딕" w:cs="맑은 고딕" w:eastAsia="맑은 고딕" w:hAnsi="맑은 고딕"/>
-          <w:sz w:val="22"/>
-          <w:szCs w:val="22"/>
-        </w:rPr>
-        <w:t>v2.6.1 (2026-05-20): (1) 논문 선정 기준 명문화 — KM vs WM 단독비교 제외(표준치료 add-on 연구만 대상), 3arm은 해당 2arm만 추출. KM·WM·KM+WM 3군 구성은 WM vs KM+WM만 추출. (2) S열 af_type_other 코드 5 케이스 세분화 — (RVR 명시 AND HR≥110) OR (RVR 미언급 AND HR≥110 명시)만 코드 5; RVR 단어만 있고 HR 기준 불충족 시 코드 5 불가, T열에 원문 표현만 기록. (3) T열 af_type_text 자유 텍스트 규칙 신설 — paroxysmal/persistent/RVR/permanent 등 AF 유형 원문 표현 보존. (4) AN/AU 분석집단 보수적 판정 — method에 명시된 것만 인정, 결과 표 분모로 추정 금지. analysis_set 코드 ITT/PP/NR 3종 → ITT/PP/FAS/NR 4종(mITT는 ITT로 통합, FAS 정식 추가). (5) QoL 미네소타 통일 명칭 = QOL(Minnesota cited) — 점수 방향이 표준 MLHFQ(낮을수록 양호)와 모순되는 케이스에 적용 (No.619·635 등). 자동 변환은 없으며 8단계 인터랙티브에서 작업자 응답대로 변환. (6) 6B 모호 케이스 체크리스트에 T열·Z열·AN/AU 추가. ※ 인프라: upgrade-skill 신설로 마스터를 "업그레이드 해줘" 한 마디로 셀프 업그레이드 가능 (`_meta` 시트 도입, spec_version 자동 추적). 열 구조는 v2.6과 동일(48열).</w:t>
-      </w:r>
-    </w:p>
-    <w:p>
-      <w:pPr>
-        <w:pStyle w:val="Heading3"/>
-        <w:spacing w:after="120" w:before="220"/>
-      </w:pPr>
-      <w:r>
-        <w:rPr>
-          <w:rFonts w:ascii="맑은 고딕" w:cs="맑은 고딕" w:eastAsia="맑은 고딕" w:hAnsi="맑은 고딕"/>
-          <w:b/>
-          <w:bCs/>
-          <w:color w:val="333333"/>
-          <w:sz w:val="23"/>
-          <w:szCs w:val="23"/>
-        </w:rPr>
-        <w:t>v2.6 주요 변경</w:t>
-      </w:r>
-    </w:p>
-    <w:p>
-      <w:pPr>
-        <w:pStyle w:val="ListParagraph"/>
-        <w:numPr>
-          <w:ilvl w:val="0"/>
-          <w:numId w:val="2"/>
-        </w:numPr>
-        <w:spacing w:after="40" w:before="40" w:line="300"/>
-      </w:pPr>
-      <w:r>
-        <w:rPr>
-          <w:rFonts w:ascii="맑은 고딕" w:cs="맑은 고딕" w:eastAsia="맑은 고딕" w:hAnsi="맑은 고딕"/>
-          <w:sz w:val="22"/>
-          <w:szCs w:val="22"/>
-        </w:rPr>
-        <w:t>v2.6 (2026-05-19): (1) study_design 분류 개정 — 随机/随机分为/randomized 표현만 있어도 RCT. 입원순서·번호순 등 systematic non-random은 non-RCT. (2) 기본정보 신규 AU열 analysis_set (ITT/PP/NR 메타분석 분류 코드). 기존 notes는 AV로 이동, 47→48열. (3) af_type_other 코드 5 (AF with RVR) 기준 엄격화 — HR≥110 명시 시만. (4) HRV 및 파생 지표 아웃컴 완전 제외 (SDNN/RMSSD/LF/HF/DC/AC 등). (5) SAE 통합 추출(AE total과 동일 방식, 논문이 SAE로 묶어 보고한 경우만). (6) 분류 모호 케이스는 6B 불확실 항목 의무 명시.</w:t>
-      </w:r>
-    </w:p>
-    <w:p>
-      <w:pPr>
-        <w:pStyle w:val="ListParagraph"/>
-      </w:pPr>
-      <w:r>
-        <w:t>v2.5.1 (2026-05-07): 토의목록_&lt;작업자&gt;.md append 동작 추가 + merge-skill v2.5.1(서식 보존) 통합. v2.5 (2026-04-30): comorbidity_code(U열) 코드 6 신설 — 高栓塞·高出血 위험. v2.4 (2026-04-20): 기본정보 시트 끝에 notes열 추가.</w:t>
-      </w:r>
-    </w:p>
-    <w:p>
-      <w:pPr>
-        <w:pStyle w:val="ListParagraph"/>
-        <w:numPr>
-          <w:ilvl w:val="0"/>
-          <w:numId w:val="2"/>
-        </w:numPr>
-        <w:spacing w:after="40" w:before="40" w:line="300"/>
-      </w:pPr>
-      <w:r>
-        <w:rPr>
-          <w:rFonts w:ascii="맑은 고딕" w:cs="맑은 고딕" w:eastAsia="맑은 고딕" w:hAnsi="맑은 고딕"/>
-          <w:sz w:val="22"/>
-          <w:szCs w:val="22"/>
-        </w:rPr>
-        <w:t xml:space="preserve">v2.3 (2026-04-20): 추출/병합 분리. 추출은 논문별 단독 파일에 저장하고, 마스터로의 통합은 merge-skill이 원자적으로 수행. 동시 세션 lost update 경쟁 조건을 해결.</w:t>
-      </w:r>
-    </w:p>
-    <w:p>
-      <w:pPr>
-        <w:pStyle w:val="ListParagraph"/>
-        <w:numPr>
-          <w:ilvl w:val="0"/>
-          <w:numId w:val="2"/>
-        </w:numPr>
-        <w:spacing w:after="40" w:before="40" w:line="300"/>
-      </w:pPr>
-      <w:r>
-        <w:rPr>
-          <w:rFonts w:ascii="맑은 고딕" w:cs="맑은 고딕" w:eastAsia="맑은 고딕" w:hAnsi="맑은 고딕"/>
-          <w:sz w:val="22"/>
-          <w:szCs w:val="22"/>
-        </w:rPr>
-        <w:t xml:space="preserve">v1.6 이전: 모든 작업자가 마스터 엑셀 1개에 직접 append → 동시 세션에서 lost update 발생 가능.</w:t>
+        </w:rPr>
+        <w:t>이전 버전(v2.9 이하)의 버전별 전체 변경 내역은 각 스킬 폴더의 CHANGELOG.md(및 GitHub Releases)를 참조한다. 본 매뉴얼은 현재 버전 사용법을 중심으로 한다.</w:t>
       </w:r>
     </w:p>
     <w:p>

</xml_diff>